<commit_message>
Update to Tables doc
Changed some webonary info and added a section on links to tables.

Change-Id: Ib83ddd42bdb771c8d7a5c74ba9ace54fac22f9a7
</commit_message>
<xml_diff>
--- a/HelpResourcesSources/TechnicalNotes/Tables in FLEx.docx
+++ b/HelpResourcesSources/TechnicalNotes/Tables in FLEx.docx
@@ -6,7 +6,7 @@
       <w:pPr>
         <w:pStyle w:val="Title"/>
       </w:pPr>
-      <w:bookmarkStart w:id="0" w:name="_Toc114043354"/>
+      <w:bookmarkStart w:id="0" w:name="_Toc193898348"/>
       <w:r>
         <w:t>Tables in FLEx</w:t>
       </w:r>
@@ -17,19 +17,8 @@
         <w:pStyle w:val="Date"/>
       </w:pPr>
       <w:r>
-        <w:t xml:space="preserve">September </w:t>
-      </w:r>
-      <w:r>
-        <w:t>1</w:t>
-      </w:r>
-      <w:r>
-        <w:t>4</w:t>
-      </w:r>
-      <w:r>
-        <w:t>, 2022</w:t>
-      </w:r>
-      <w:bookmarkStart w:id="1" w:name="_GoBack"/>
-      <w:bookmarkEnd w:id="1"/>
+        <w:t>March 26, 2025</w:t>
+      </w:r>
       <w:r>
         <w:br/>
         <w:t>Ken Zook</w:t>
@@ -66,9 +55,10 @@
           <w:noProof/>
           <w:sz w:val="22"/>
           <w:szCs w:val="22"/>
+          <w:lang w:eastAsia="en-US"/>
         </w:rPr>
       </w:pPr>
-      <w:hyperlink w:anchor="_Toc114043354" w:history="1">
+      <w:hyperlink w:anchor="_Toc193898348" w:history="1">
         <w:r>
           <w:rPr>
             <w:rStyle w:val="Hyperlink"/>
@@ -95,7 +85,7 @@
             <w:noProof/>
             <w:webHidden/>
           </w:rPr>
-          <w:instrText xml:space="preserve"> PAGEREF _Toc114043354 \h </w:instrText>
+          <w:instrText xml:space="preserve"> PAGEREF _Toc193898348 \h </w:instrText>
         </w:r>
         <w:r>
           <w:rPr>
@@ -138,9 +128,10 @@
           <w:noProof/>
           <w:sz w:val="22"/>
           <w:szCs w:val="22"/>
+          <w:lang w:eastAsia="en-US"/>
         </w:rPr>
       </w:pPr>
-      <w:hyperlink w:anchor="_Toc114043355" w:history="1">
+      <w:hyperlink w:anchor="_Toc193898349" w:history="1">
         <w:r>
           <w:rPr>
             <w:rStyle w:val="Hyperlink"/>
@@ -154,6 +145,7 @@
             <w:noProof/>
             <w:sz w:val="22"/>
             <w:szCs w:val="22"/>
+            <w:lang w:eastAsia="en-US"/>
           </w:rPr>
           <w:tab/>
         </w:r>
@@ -183,7 +175,7 @@
             <w:noProof/>
             <w:webHidden/>
           </w:rPr>
-          <w:instrText xml:space="preserve"> PAGEREF _Toc114043355 \h </w:instrText>
+          <w:instrText xml:space="preserve"> PAGEREF _Toc193898349 \h </w:instrText>
         </w:r>
         <w:r>
           <w:rPr>
@@ -226,9 +218,10 @@
           <w:noProof/>
           <w:sz w:val="22"/>
           <w:szCs w:val="22"/>
+          <w:lang w:eastAsia="en-US"/>
         </w:rPr>
       </w:pPr>
-      <w:hyperlink w:anchor="_Toc114043356" w:history="1">
+      <w:hyperlink w:anchor="_Toc193898350" w:history="1">
         <w:r>
           <w:rPr>
             <w:rStyle w:val="Hyperlink"/>
@@ -242,6 +235,7 @@
             <w:noProof/>
             <w:sz w:val="22"/>
             <w:szCs w:val="22"/>
+            <w:lang w:eastAsia="en-US"/>
           </w:rPr>
           <w:tab/>
         </w:r>
@@ -271,7 +265,7 @@
             <w:noProof/>
             <w:webHidden/>
           </w:rPr>
-          <w:instrText xml:space="preserve"> PAGEREF _Toc114043356 \h </w:instrText>
+          <w:instrText xml:space="preserve"> PAGEREF _Toc193898350 \h </w:instrText>
         </w:r>
         <w:r>
           <w:rPr>
@@ -314,9 +308,10 @@
           <w:noProof/>
           <w:sz w:val="22"/>
           <w:szCs w:val="22"/>
+          <w:lang w:eastAsia="en-US"/>
         </w:rPr>
       </w:pPr>
-      <w:hyperlink w:anchor="_Toc114043357" w:history="1">
+      <w:hyperlink w:anchor="_Toc193898351" w:history="1">
         <w:r>
           <w:rPr>
             <w:rStyle w:val="Hyperlink"/>
@@ -330,6 +325,7 @@
             <w:noProof/>
             <w:sz w:val="22"/>
             <w:szCs w:val="22"/>
+            <w:lang w:eastAsia="en-US"/>
           </w:rPr>
           <w:tab/>
         </w:r>
@@ -359,7 +355,7 @@
             <w:noProof/>
             <w:webHidden/>
           </w:rPr>
-          <w:instrText xml:space="preserve"> PAGEREF _Toc114043357 \h </w:instrText>
+          <w:instrText xml:space="preserve"> PAGEREF _Toc193898351 \h </w:instrText>
         </w:r>
         <w:r>
           <w:rPr>
@@ -402,9 +398,10 @@
           <w:noProof/>
           <w:sz w:val="22"/>
           <w:szCs w:val="22"/>
+          <w:lang w:eastAsia="en-US"/>
         </w:rPr>
       </w:pPr>
-      <w:hyperlink w:anchor="_Toc114043358" w:history="1">
+      <w:hyperlink w:anchor="_Toc193898352" w:history="1">
         <w:r>
           <w:rPr>
             <w:rStyle w:val="Hyperlink"/>
@@ -418,6 +415,7 @@
             <w:noProof/>
             <w:sz w:val="22"/>
             <w:szCs w:val="22"/>
+            <w:lang w:eastAsia="en-US"/>
           </w:rPr>
           <w:tab/>
         </w:r>
@@ -447,7 +445,7 @@
             <w:noProof/>
             <w:webHidden/>
           </w:rPr>
-          <w:instrText xml:space="preserve"> PAGEREF _Toc114043358 \h </w:instrText>
+          <w:instrText xml:space="preserve"> PAGEREF _Toc193898352 \h </w:instrText>
         </w:r>
         <w:r>
           <w:rPr>
@@ -490,9 +488,10 @@
           <w:noProof/>
           <w:sz w:val="22"/>
           <w:szCs w:val="22"/>
+          <w:lang w:eastAsia="en-US"/>
         </w:rPr>
       </w:pPr>
-      <w:hyperlink w:anchor="_Toc114043359" w:history="1">
+      <w:hyperlink w:anchor="_Toc193898353" w:history="1">
         <w:r>
           <w:rPr>
             <w:rStyle w:val="Hyperlink"/>
@@ -506,6 +505,7 @@
             <w:noProof/>
             <w:sz w:val="22"/>
             <w:szCs w:val="22"/>
+            <w:lang w:eastAsia="en-US"/>
           </w:rPr>
           <w:tab/>
         </w:r>
@@ -535,7 +535,7 @@
             <w:noProof/>
             <w:webHidden/>
           </w:rPr>
-          <w:instrText xml:space="preserve"> PAGEREF _Toc114043359 \h </w:instrText>
+          <w:instrText xml:space="preserve"> PAGEREF _Toc193898353 \h </w:instrText>
         </w:r>
         <w:r>
           <w:rPr>
@@ -578,9 +578,10 @@
           <w:noProof/>
           <w:sz w:val="22"/>
           <w:szCs w:val="22"/>
+          <w:lang w:eastAsia="en-US"/>
         </w:rPr>
       </w:pPr>
-      <w:hyperlink w:anchor="_Toc114043360" w:history="1">
+      <w:hyperlink w:anchor="_Toc193898354" w:history="1">
         <w:r>
           <w:rPr>
             <w:rStyle w:val="Hyperlink"/>
@@ -594,6 +595,7 @@
             <w:noProof/>
             <w:sz w:val="22"/>
             <w:szCs w:val="22"/>
+            <w:lang w:eastAsia="en-US"/>
           </w:rPr>
           <w:tab/>
         </w:r>
@@ -623,7 +625,7 @@
             <w:noProof/>
             <w:webHidden/>
           </w:rPr>
-          <w:instrText xml:space="preserve"> PAGEREF _Toc114043360 \h </w:instrText>
+          <w:instrText xml:space="preserve"> PAGEREF _Toc193898354 \h </w:instrText>
         </w:r>
         <w:r>
           <w:rPr>
@@ -666,9 +668,10 @@
           <w:noProof/>
           <w:sz w:val="22"/>
           <w:szCs w:val="22"/>
+          <w:lang w:eastAsia="en-US"/>
         </w:rPr>
       </w:pPr>
-      <w:hyperlink w:anchor="_Toc114043361" w:history="1">
+      <w:hyperlink w:anchor="_Toc193898355" w:history="1">
         <w:r>
           <w:rPr>
             <w:rStyle w:val="Hyperlink"/>
@@ -682,6 +685,7 @@
             <w:noProof/>
             <w:sz w:val="22"/>
             <w:szCs w:val="22"/>
+            <w:lang w:eastAsia="en-US"/>
           </w:rPr>
           <w:tab/>
         </w:r>
@@ -711,7 +715,7 @@
             <w:noProof/>
             <w:webHidden/>
           </w:rPr>
-          <w:instrText xml:space="preserve"> PAGEREF _Toc114043361 \h </w:instrText>
+          <w:instrText xml:space="preserve"> PAGEREF _Toc193898355 \h </w:instrText>
         </w:r>
         <w:r>
           <w:rPr>
@@ -744,16 +748,106 @@
     </w:p>
     <w:p>
       <w:pPr>
+        <w:pStyle w:val="TOC1"/>
+        <w:tabs>
+          <w:tab w:val="left" w:pos="480"/>
+          <w:tab w:val="right" w:leader="dot" w:pos="8630"/>
+        </w:tabs>
+        <w:rPr>
+          <w:rFonts w:asciiTheme="minorHAnsi" w:eastAsiaTheme="minorEastAsia" w:hAnsiTheme="minorHAnsi" w:cstheme="minorBidi"/>
+          <w:noProof/>
+          <w:sz w:val="22"/>
+          <w:szCs w:val="22"/>
+          <w:lang w:eastAsia="en-US"/>
+        </w:rPr>
+      </w:pPr>
+      <w:hyperlink w:anchor="_Toc193898356" w:history="1">
+        <w:r>
+          <w:rPr>
+            <w:rStyle w:val="Hyperlink"/>
+            <w:noProof/>
+          </w:rPr>
+          <w:t>8</w:t>
+        </w:r>
+        <w:r>
+          <w:rPr>
+            <w:rFonts w:asciiTheme="minorHAnsi" w:eastAsiaTheme="minorEastAsia" w:hAnsiTheme="minorHAnsi" w:cstheme="minorBidi"/>
+            <w:noProof/>
+            <w:sz w:val="22"/>
+            <w:szCs w:val="22"/>
+            <w:lang w:eastAsia="en-US"/>
+          </w:rPr>
+          <w:tab/>
+        </w:r>
+        <w:r>
+          <w:rPr>
+            <w:rStyle w:val="Hyperlink"/>
+            <w:noProof/>
+          </w:rPr>
+          <w:t>Links to entries with tables</w:t>
+        </w:r>
+        <w:r>
+          <w:rPr>
+            <w:noProof/>
+            <w:webHidden/>
+          </w:rPr>
+          <w:tab/>
+        </w:r>
+        <w:r>
+          <w:rPr>
+            <w:noProof/>
+            <w:webHidden/>
+          </w:rPr>
+          <w:fldChar w:fldCharType="begin"/>
+        </w:r>
+        <w:r>
+          <w:rPr>
+            <w:noProof/>
+            <w:webHidden/>
+          </w:rPr>
+          <w:instrText xml:space="preserve"> PAGEREF _Toc193898356 \h </w:instrText>
+        </w:r>
+        <w:r>
+          <w:rPr>
+            <w:noProof/>
+            <w:webHidden/>
+          </w:rPr>
+        </w:r>
+        <w:r>
+          <w:rPr>
+            <w:noProof/>
+            <w:webHidden/>
+          </w:rPr>
+          <w:fldChar w:fldCharType="separate"/>
+        </w:r>
+        <w:r>
+          <w:rPr>
+            <w:noProof/>
+            <w:webHidden/>
+          </w:rPr>
+          <w:t>7</w:t>
+        </w:r>
+        <w:r>
+          <w:rPr>
+            <w:noProof/>
+            <w:webHidden/>
+          </w:rPr>
+          <w:fldChar w:fldCharType="end"/>
+        </w:r>
+      </w:hyperlink>
+    </w:p>
+    <w:p>
+      <w:pPr>
         <w:pStyle w:val="Heading1"/>
       </w:pPr>
       <w:r>
         <w:fldChar w:fldCharType="end"/>
       </w:r>
-      <w:bookmarkStart w:id="2" w:name="_Toc114043355"/>
+      <w:bookmarkStart w:id="1" w:name="_Toc193898349"/>
       <w:r>
         <w:t>Introduction</w:t>
       </w:r>
-      <w:bookmarkEnd w:id="2"/>
+      <w:bookmarkEnd w:id="1"/>
     </w:p>
     <w:p>
       <w:pPr>
@@ -1076,11 +1170,11 @@
       <w:pPr>
         <w:pStyle w:val="Heading1"/>
       </w:pPr>
-      <w:bookmarkStart w:id="3" w:name="_Toc114043356"/>
+      <w:bookmarkStart w:id="2" w:name="_Toc193898350"/>
       <w:r>
         <w:t>Table specifications</w:t>
       </w:r>
-      <w:bookmarkEnd w:id="3"/>
+      <w:bookmarkEnd w:id="2"/>
     </w:p>
     <w:p>
       <w:pPr>
@@ -1097,23 +1191,11 @@
       </w:r>
       <w:proofErr w:type="spellStart"/>
       <w:r>
-        <w:t>Shi</w:t>
-      </w:r>
-      <w:r>
-        <w:t>f</w:t>
-      </w:r>
-      <w:r>
-        <w:t>t+Return</w:t>
+        <w:t>Shift+Return</w:t>
       </w:r>
       <w:proofErr w:type="spellEnd"/>
       <w:r>
-        <w:t xml:space="preserve"> can be used to force new lines to make it a little easier to see the table structure</w:t>
-      </w:r>
-      <w:r>
-        <w:t xml:space="preserve"> in the data entry field</w:t>
-      </w:r>
-      <w:r>
-        <w:t>. The formatted table will be displayed in the preview window</w:t>
+        <w:t xml:space="preserve"> can be used to force new lines to make it a little easier to see the table structure in the data entry field. The formatted table will be displayed in the preview window</w:t>
       </w:r>
       <w:r>
         <w:t>, the dictionary</w:t>
@@ -1693,11 +1775,11 @@
       <w:pPr>
         <w:pStyle w:val="Heading1"/>
       </w:pPr>
-      <w:bookmarkStart w:id="4" w:name="_Toc114043357"/>
+      <w:bookmarkStart w:id="3" w:name="_Toc193898351"/>
       <w:r>
         <w:t>Sample tables</w:t>
       </w:r>
-      <w:bookmarkEnd w:id="4"/>
+      <w:bookmarkEnd w:id="3"/>
     </w:p>
     <w:p>
       <w:pPr>
@@ -1767,21 +1849,7 @@
       </w:r>
       <w:r>
         <w:br/>
-      </w:r>
-      <w:r>
-        <w:t xml:space="preserve">\tr \tc1 </w:t>
-      </w:r>
-      <w:r>
-        <w:t>deux</w:t>
-      </w:r>
-      <w:r>
-        <w:t xml:space="preserve"> \tc2 </w:t>
-      </w:r>
-      <w:r>
-        <w:t>two</w:t>
-      </w:r>
-      <w:r>
-        <w:t xml:space="preserve"> \tc3 </w:t>
+        <w:t xml:space="preserve">\tr \tc1 deux \tc2 two \tc3 </w:t>
       </w:r>
       <w:r>
         <w:t>2</w:t>
@@ -1939,10 +2007,7 @@
         <w:pStyle w:val="BodyText"/>
       </w:pPr>
       <w:r>
-        <w:t>I</w:t>
-      </w:r>
-      <w:r>
-        <w:t xml:space="preserve">t would be nice to have the title larger and bold. </w:t>
+        <w:t xml:space="preserve">It would be nice to have the title larger and bold. </w:t>
       </w:r>
       <w:r>
         <w:t xml:space="preserve">We can use regular or custom styles to change the appearance of text in the table. </w:t>
@@ -2052,16 +2117,16 @@
       <w:pPr>
         <w:pStyle w:val="Heading1"/>
       </w:pPr>
-      <w:bookmarkStart w:id="5" w:name="_Ref114036984"/>
-      <w:bookmarkStart w:id="6" w:name="_Toc114043358"/>
+      <w:bookmarkStart w:id="4" w:name="_Ref114036984"/>
+      <w:bookmarkStart w:id="5" w:name="_Toc193898352"/>
       <w:r>
         <w:t>Customizing table</w:t>
       </w:r>
       <w:r>
         <w:t xml:space="preserve"> styles</w:t>
       </w:r>
+      <w:bookmarkEnd w:id="4"/>
       <w:bookmarkEnd w:id="5"/>
-      <w:bookmarkEnd w:id="6"/>
     </w:p>
     <w:p>
       <w:pPr>
@@ -2647,11 +2712,11 @@
       <w:pPr>
         <w:pStyle w:val="Heading1"/>
       </w:pPr>
-      <w:bookmarkStart w:id="7" w:name="_Toc114043359"/>
+      <w:bookmarkStart w:id="6" w:name="_Toc193898353"/>
       <w:r>
         <w:t>Importing tables from SFM</w:t>
       </w:r>
-      <w:bookmarkEnd w:id="7"/>
+      <w:bookmarkEnd w:id="6"/>
     </w:p>
     <w:p>
       <w:pPr>
@@ -2783,16 +2848,7 @@
     <w:p>
       <w:r>
         <w:lastRenderedPageBreak/>
-        <w:t xml:space="preserve">You’ll notice there is a </w:t>
-      </w:r>
-      <w:r>
-        <w:t>U+</w:t>
-      </w:r>
-      <w:r>
-        <w:t xml:space="preserve">2028 code at the beginning of each line of the table. This makes it format nicely in data entry and also keeps the backslash codes from being interpreted as SFM codes for the import. </w:t>
-      </w:r>
-      <w:r>
-        <w:t>Inline markers can be used for styles and languages.</w:t>
+        <w:t>You’ll notice there is a U+2028 code at the beginning of each line of the table. This makes it format nicely in data entry and also keeps the backslash codes from being interpreted as SFM codes for the import. Inline markers can be used for styles and languages.</w:t>
       </w:r>
       <w:r>
         <w:t xml:space="preserve"> In this case, in the Import setup,</w:t>
@@ -2817,10 +2873,172 @@
       <w:pPr>
         <w:pStyle w:val="Heading1"/>
       </w:pPr>
-      <w:bookmarkStart w:id="8" w:name="_Toc114043360"/>
+      <w:bookmarkStart w:id="7" w:name="_Toc193898354"/>
       <w:r>
         <w:t>Importing tables from LIFT</w:t>
       </w:r>
+      <w:bookmarkEnd w:id="7"/>
+    </w:p>
+    <w:p>
+      <w:pPr>
+        <w:pStyle w:val="BodyText"/>
+      </w:pPr>
+      <w:r>
+        <w:t>In a LIFT file, the sample we’ve been looking at would be like this.</w:t>
+      </w:r>
+    </w:p>
+    <w:p>
+      <w:pPr>
+        <w:pStyle w:val="BodyText"/>
+      </w:pPr>
+      <w:r>
+        <w:t>&lt;field type="English Table"&gt;</w:t>
+      </w:r>
+    </w:p>
+    <w:p>
+      <w:pPr>
+        <w:pStyle w:val="BodyText"/>
+      </w:pPr>
+      <w:r>
+        <w:t xml:space="preserve">&lt;form </w:t>
+      </w:r>
+      <w:proofErr w:type="spellStart"/>
+      <w:r>
+        <w:t>lang</w:t>
+      </w:r>
+      <w:proofErr w:type="spellEnd"/>
+      <w:r>
+        <w:t>="</w:t>
+      </w:r>
+      <w:proofErr w:type="spellStart"/>
+      <w:r>
+        <w:t>en</w:t>
+      </w:r>
+      <w:proofErr w:type="spellEnd"/>
+      <w:r>
+        <w:t>"&gt;&lt;text&gt;\d &lt;span class="Table Title"&gt;Table of Numbers&lt;/span&gt;</w:t>
+      </w:r>
+    </w:p>
+    <w:p>
+      <w:pPr>
+        <w:pStyle w:val="BodyText"/>
+      </w:pPr>
+      <w:r>
+        <w:t xml:space="preserve">\tr \th1 French \th2 English \th3 Number </w:t>
+      </w:r>
+    </w:p>
+    <w:p>
+      <w:pPr>
+        <w:pStyle w:val="BodyText"/>
+      </w:pPr>
+      <w:r>
+        <w:t xml:space="preserve">\tr \tc1 &lt;span </w:t>
+      </w:r>
+      <w:proofErr w:type="spellStart"/>
+      <w:r>
+        <w:t>lang</w:t>
+      </w:r>
+      <w:proofErr w:type="spellEnd"/>
+      <w:r>
+        <w:t>="</w:t>
+      </w:r>
+      <w:proofErr w:type="spellStart"/>
+      <w:r>
+        <w:t>fr</w:t>
+      </w:r>
+      <w:proofErr w:type="spellEnd"/>
+      <w:r>
+        <w:t>" class="Strong"&gt;un&lt;/span&gt; \tc2 one \tcr3 1</w:t>
+      </w:r>
+    </w:p>
+    <w:p>
+      <w:pPr>
+        <w:pStyle w:val="BodyText"/>
+      </w:pPr>
+      <w:r>
+        <w:t xml:space="preserve">\tr \tc1 &lt;span </w:t>
+      </w:r>
+      <w:proofErr w:type="spellStart"/>
+      <w:r>
+        <w:t>lang</w:t>
+      </w:r>
+      <w:proofErr w:type="spellEnd"/>
+      <w:r>
+        <w:t>="</w:t>
+      </w:r>
+      <w:proofErr w:type="spellStart"/>
+      <w:r>
+        <w:t>fr</w:t>
+      </w:r>
+      <w:proofErr w:type="spellEnd"/>
+      <w:r>
+        <w:t>" class="Strong"&gt;deux&lt;/span&gt; \tc2 two \tcr3 2</w:t>
+      </w:r>
+    </w:p>
+    <w:p>
+      <w:pPr>
+        <w:pStyle w:val="BodyText"/>
+      </w:pPr>
+      <w:r>
+        <w:t xml:space="preserve">\tr \tc1 &lt;span </w:t>
+      </w:r>
+      <w:proofErr w:type="spellStart"/>
+      <w:r>
+        <w:t>lang</w:t>
+      </w:r>
+      <w:proofErr w:type="spellEnd"/>
+      <w:r>
+        <w:t>="</w:t>
+      </w:r>
+      <w:proofErr w:type="spellStart"/>
+      <w:r>
+        <w:t>fr</w:t>
+      </w:r>
+      <w:proofErr w:type="spellEnd"/>
+      <w:r>
+        <w:t>" class="Strong"&gt;dix&lt;/span&gt; \tc2 ten \tcr3 10&lt;/text&gt;&lt;/form&gt;</w:t>
+      </w:r>
+    </w:p>
+    <w:p>
+      <w:pPr>
+        <w:pStyle w:val="BodyText"/>
+      </w:pPr>
+      <w:r>
+        <w:t>&lt;/field&gt;</w:t>
+      </w:r>
+    </w:p>
+    <w:p>
+      <w:pPr>
+        <w:pStyle w:val="BodyText"/>
+      </w:pPr>
+      <w:r>
+        <w:t xml:space="preserve">This includes the standard format </w:t>
+      </w:r>
+      <w:proofErr w:type="spellStart"/>
+      <w:r>
+        <w:t>markera</w:t>
+      </w:r>
+      <w:proofErr w:type="spellEnd"/>
+      <w:r>
+        <w:t xml:space="preserve"> and spans designating the writing system and style for each cell content. Instead of U+2028 for </w:t>
+      </w:r>
+      <w:proofErr w:type="spellStart"/>
+      <w:r>
+        <w:t>Shift+Return</w:t>
+      </w:r>
+      <w:proofErr w:type="spellEnd"/>
+      <w:r>
+        <w:t>, the XML file simply uses a &lt;CR&gt;&lt;LF&gt;. The field type is the custom field name.</w:t>
+      </w:r>
+    </w:p>
+    <w:p>
+      <w:pPr>
+        <w:pStyle w:val="Heading1"/>
+      </w:pPr>
+      <w:bookmarkStart w:id="8" w:name="_Toc193898355"/>
+      <w:r>
+        <w:t>Exporting tables to Webonary</w:t>
+      </w:r>
       <w:bookmarkEnd w:id="8"/>
     </w:p>
     <w:p>
@@ -2828,190 +3046,25 @@
         <w:pStyle w:val="BodyText"/>
       </w:pPr>
       <w:r>
-        <w:t>In a LIFT file, the sample we’ve been looking at would be like this.</w:t>
-      </w:r>
-    </w:p>
-    <w:p>
-      <w:pPr>
-        <w:pStyle w:val="BodyText"/>
-      </w:pPr>
-      <w:r>
-        <w:t>&lt;field type="English Table"&gt;</w:t>
-      </w:r>
-    </w:p>
-    <w:p>
-      <w:pPr>
-        <w:pStyle w:val="BodyText"/>
-      </w:pPr>
-      <w:r>
-        <w:t xml:space="preserve">&lt;form </w:t>
-      </w:r>
-      <w:proofErr w:type="spellStart"/>
-      <w:r>
-        <w:t>lang</w:t>
-      </w:r>
-      <w:proofErr w:type="spellEnd"/>
-      <w:r>
-        <w:t>="</w:t>
-      </w:r>
-      <w:proofErr w:type="spellStart"/>
-      <w:r>
-        <w:t>en</w:t>
-      </w:r>
-      <w:proofErr w:type="spellEnd"/>
-      <w:r>
-        <w:t>"&gt;&lt;text&gt;\d &lt;span class="Table Title"&gt;Table of Numbers&lt;/span&gt;</w:t>
-      </w:r>
-    </w:p>
-    <w:p>
-      <w:pPr>
-        <w:pStyle w:val="BodyText"/>
-      </w:pPr>
-      <w:r>
-        <w:t xml:space="preserve">\tr \th1 French \th2 English \th3 Number </w:t>
-      </w:r>
-    </w:p>
-    <w:p>
-      <w:pPr>
-        <w:pStyle w:val="BodyText"/>
-      </w:pPr>
-      <w:r>
-        <w:t xml:space="preserve">\tr \tc1 &lt;span </w:t>
-      </w:r>
-      <w:proofErr w:type="spellStart"/>
-      <w:r>
-        <w:t>lang</w:t>
-      </w:r>
-      <w:proofErr w:type="spellEnd"/>
-      <w:r>
-        <w:t>="</w:t>
-      </w:r>
-      <w:proofErr w:type="spellStart"/>
-      <w:r>
-        <w:t>fr</w:t>
-      </w:r>
-      <w:proofErr w:type="spellEnd"/>
-      <w:r>
-        <w:t>" class="Strong"&gt;un&lt;/span&gt; \tc2 one \tcr3 1</w:t>
-      </w:r>
-    </w:p>
-    <w:p>
-      <w:pPr>
-        <w:pStyle w:val="BodyText"/>
-      </w:pPr>
-      <w:r>
-        <w:t xml:space="preserve">\tr \tc1 &lt;span </w:t>
-      </w:r>
-      <w:proofErr w:type="spellStart"/>
-      <w:r>
-        <w:t>lang</w:t>
-      </w:r>
-      <w:proofErr w:type="spellEnd"/>
-      <w:r>
-        <w:t>="</w:t>
-      </w:r>
-      <w:proofErr w:type="spellStart"/>
-      <w:r>
-        <w:t>fr</w:t>
-      </w:r>
-      <w:proofErr w:type="spellEnd"/>
-      <w:r>
-        <w:t>" class="Strong"&gt;deux&lt;/span&gt; \tc2 two \tcr3 2</w:t>
-      </w:r>
-    </w:p>
-    <w:p>
-      <w:pPr>
-        <w:pStyle w:val="BodyText"/>
-      </w:pPr>
-      <w:r>
-        <w:t xml:space="preserve">\tr \tc1 &lt;span </w:t>
-      </w:r>
-      <w:proofErr w:type="spellStart"/>
-      <w:r>
-        <w:t>lang</w:t>
-      </w:r>
-      <w:proofErr w:type="spellEnd"/>
-      <w:r>
-        <w:t>="</w:t>
-      </w:r>
-      <w:proofErr w:type="spellStart"/>
-      <w:r>
-        <w:t>fr</w:t>
-      </w:r>
-      <w:proofErr w:type="spellEnd"/>
-      <w:r>
-        <w:t>" class="Strong"&gt;dix&lt;/span&gt; \tc2 ten \tcr3 10&lt;/text&gt;&lt;/form&gt;</w:t>
-      </w:r>
-    </w:p>
-    <w:p>
-      <w:pPr>
-        <w:pStyle w:val="BodyText"/>
-      </w:pPr>
-      <w:r>
-        <w:t>&lt;/field&gt;</w:t>
-      </w:r>
-    </w:p>
-    <w:p>
-      <w:pPr>
-        <w:pStyle w:val="BodyText"/>
-      </w:pPr>
-      <w:r>
-        <w:t xml:space="preserve">This includes the standard format </w:t>
-      </w:r>
-      <w:proofErr w:type="spellStart"/>
-      <w:r>
-        <w:t>markera</w:t>
-      </w:r>
-      <w:proofErr w:type="spellEnd"/>
-      <w:r>
-        <w:t xml:space="preserve"> and spans designating the writing system and style for each cell content. Instead of U+2028 for </w:t>
-      </w:r>
-      <w:proofErr w:type="spellStart"/>
-      <w:r>
-        <w:t>Shift+Return</w:t>
-      </w:r>
-      <w:proofErr w:type="spellEnd"/>
-      <w:r>
-        <w:t>, the XML file simply uses a &lt;CR&gt;&lt;LF&gt;. The field type is the custom field name.</w:t>
-      </w:r>
-    </w:p>
-    <w:p>
-      <w:pPr>
-        <w:pStyle w:val="Heading1"/>
-      </w:pPr>
-      <w:bookmarkStart w:id="9" w:name="_Toc114043361"/>
-      <w:r>
-        <w:t xml:space="preserve">Exporting </w:t>
-      </w:r>
-      <w:r>
-        <w:t xml:space="preserve">tables </w:t>
-      </w:r>
-      <w:r>
-        <w:t>to Webonary</w:t>
-      </w:r>
-      <w:bookmarkEnd w:id="9"/>
-    </w:p>
-    <w:p>
-      <w:pPr>
-        <w:pStyle w:val="BodyText"/>
-      </w:pPr>
-      <w:r>
-        <w:t>When we upload our table to Webonary, it looks like this:</w:t>
-      </w:r>
-    </w:p>
-    <w:p>
-      <w:pPr>
-        <w:pStyle w:val="BodyText"/>
-      </w:pPr>
-      <w:r>
-        <w:rPr>
-          <w:noProof/>
-        </w:rPr>
+        <w:t xml:space="preserve">When we upload our table to Webonary, it </w:t>
+      </w:r>
+      <w:r>
+        <w:t>may look</w:t>
+      </w:r>
+      <w:r>
+        <w:t xml:space="preserve"> like this:</w:t>
+      </w:r>
+    </w:p>
+    <w:p>
+      <w:pPr>
+        <w:pStyle w:val="BodyText"/>
+      </w:pPr>
+      <w:r>
         <w:drawing>
-          <wp:inline distT="0" distB="0" distL="0" distR="0" wp14:anchorId="7127BF4F" wp14:editId="1CE33ABA">
-            <wp:extent cx="2914650" cy="1362075"/>
-            <wp:effectExtent l="0" t="0" r="0" b="9525"/>
-            <wp:docPr id="15" name="Picture 15"/>
+          <wp:inline distT="0" distB="0" distL="0" distR="0" wp14:anchorId="0B64DF05" wp14:editId="23AD6B1F">
+            <wp:extent cx="5486400" cy="1259205"/>
+            <wp:effectExtent l="0" t="0" r="0" b="0"/>
+            <wp:docPr id="6" name="Picture 6"/>
             <wp:cNvGraphicFramePr>
               <a:graphicFrameLocks xmlns:a="http://schemas.openxmlformats.org/drawingml/2006/main" noChangeAspect="1"/>
             </wp:cNvGraphicFramePr>
@@ -3031,7 +3084,7 @@
                   <pic:spPr>
                     <a:xfrm>
                       <a:off x="0" y="0"/>
-                      <a:ext cx="2914650" cy="1362075"/>
+                      <a:ext cx="5486400" cy="1259205"/>
                     </a:xfrm>
                     <a:prstGeom prst="rect">
                       <a:avLst/>
@@ -3055,15 +3108,13 @@
         <w:t xml:space="preserve">limited </w:t>
       </w:r>
       <w:r>
-        <w:t xml:space="preserve">customizations to adjust the final results. This is done using CSS style overrides in </w:t>
-      </w:r>
-      <w:proofErr w:type="spellStart"/>
-      <w:r>
-        <w:t>Wedonary</w:t>
-      </w:r>
-      <w:proofErr w:type="spellEnd"/>
-      <w:r>
-        <w:t>.</w:t>
+        <w:t>customizations to adjust the final results. This is done using CSS style overrides in We</w:t>
+      </w:r>
+      <w:r>
+        <w:t>b</w:t>
+      </w:r>
+      <w:r>
+        <w:t>onary.</w:t>
       </w:r>
     </w:p>
     <w:p>
@@ -3075,25 +3126,22 @@
       </w:r>
       <w:proofErr w:type="gramStart"/>
       <w:r>
-        <w:t>make adjustments</w:t>
+        <w:t xml:space="preserve">make </w:t>
+      </w:r>
+      <w:bookmarkStart w:id="9" w:name="_GoBack"/>
+      <w:bookmarkEnd w:id="9"/>
+      <w:r>
+        <w:t>adjustments</w:t>
       </w:r>
       <w:proofErr w:type="gramEnd"/>
       <w:r>
-        <w:t xml:space="preserve"> for </w:t>
-      </w:r>
-      <w:proofErr w:type="spellStart"/>
-      <w:r>
-        <w:t>We</w:t>
+        <w:t xml:space="preserve"> for We</w:t>
       </w:r>
       <w:r>
         <w:t>b</w:t>
       </w:r>
       <w:r>
-        <w:t>onary</w:t>
-      </w:r>
-      <w:proofErr w:type="spellEnd"/>
-      <w:r>
-        <w:t xml:space="preserve">, log </w:t>
+        <w:t xml:space="preserve">onary, log </w:t>
       </w:r>
       <w:r>
         <w:t>in</w:t>
@@ -3138,7 +3186,13 @@
         <w:fldChar w:fldCharType="end"/>
       </w:r>
       <w:r>
-        <w:t>. Here are some changes we could paste into this window</w:t>
+        <w:t xml:space="preserve">. </w:t>
+      </w:r>
+      <w:r>
+        <w:t xml:space="preserve">The display will immediately show the results of any changes you make here. </w:t>
+      </w:r>
+      <w:r>
+        <w:t>Here are some changes we could paste into this window</w:t>
       </w:r>
       <w:r>
         <w:t xml:space="preserve"> to remove the border lines</w:t>
@@ -3149,10 +3203,12 @@
     </w:p>
     <w:p>
       <w:pPr>
+        <w:pStyle w:val="BodyText"/>
         <w:rPr>
           <w:rFonts w:asciiTheme="minorHAnsi" w:hAnsiTheme="minorHAnsi" w:cstheme="minorBidi"/>
         </w:rPr>
       </w:pPr>
+      <w:proofErr w:type="gramStart"/>
       <w:r>
         <w:rPr>
           <w:rFonts w:asciiTheme="minorHAnsi" w:hAnsiTheme="minorHAnsi" w:cstheme="minorBidi"/>
@@ -3167,32 +3223,111 @@
         <w:t>pageentry</w:t>
       </w:r>
       <w:proofErr w:type="spellEnd"/>
+      <w:proofErr w:type="gramEnd"/>
       <w:r>
         <w:rPr>
           <w:rFonts w:asciiTheme="minorHAnsi" w:hAnsiTheme="minorHAnsi" w:cstheme="minorBidi"/>
         </w:rPr>
         <w:t xml:space="preserve"> tr td {</w:t>
       </w:r>
-    </w:p>
-    <w:p>
-      <w:pPr>
+      <w:r>
         <w:rPr>
           <w:rFonts w:asciiTheme="minorHAnsi" w:hAnsiTheme="minorHAnsi" w:cstheme="minorBidi"/>
         </w:rPr>
-      </w:pPr>
+        <w:br/>
+      </w:r>
       <w:r>
         <w:rPr>
           <w:rFonts w:asciiTheme="minorHAnsi" w:hAnsiTheme="minorHAnsi" w:cstheme="minorBidi"/>
         </w:rPr>
-        <w:t xml:space="preserve">  border-top: none;</w:t>
-      </w:r>
-    </w:p>
-    <w:p>
-      <w:pPr>
+        <w:tab/>
+        <w:t>border-top: none;</w:t>
+      </w:r>
+      <w:r>
         <w:rPr>
           <w:rFonts w:asciiTheme="minorHAnsi" w:hAnsiTheme="minorHAnsi" w:cstheme="minorBidi"/>
         </w:rPr>
-      </w:pPr>
+        <w:br/>
+      </w:r>
+      <w:r>
+        <w:rPr>
+          <w:rFonts w:asciiTheme="minorHAnsi" w:hAnsiTheme="minorHAnsi" w:cstheme="minorBidi"/>
+        </w:rPr>
+        <w:tab/>
+        <w:t>padding: 2px</w:t>
+      </w:r>
+      <w:r>
+        <w:rPr>
+          <w:rFonts w:asciiTheme="minorHAnsi" w:hAnsiTheme="minorHAnsi" w:cstheme="minorBidi"/>
+        </w:rPr>
+        <w:br/>
+      </w:r>
+      <w:r>
+        <w:rPr>
+          <w:rFonts w:asciiTheme="minorHAnsi" w:hAnsiTheme="minorHAnsi" w:cstheme="minorBidi"/>
+        </w:rPr>
+        <w:lastRenderedPageBreak/>
+        <w:tab/>
+        <w:t>}</w:t>
+      </w:r>
+      <w:r>
+        <w:rPr>
+          <w:rFonts w:asciiTheme="minorHAnsi" w:hAnsiTheme="minorHAnsi" w:cstheme="minorBidi"/>
+        </w:rPr>
+        <w:br/>
+      </w:r>
+      <w:r>
+        <w:rPr>
+          <w:rFonts w:asciiTheme="minorHAnsi" w:hAnsiTheme="minorHAnsi" w:cstheme="minorBidi"/>
+        </w:rPr>
+        <w:t>.</w:t>
+      </w:r>
+      <w:proofErr w:type="spellStart"/>
+      <w:r>
+        <w:rPr>
+          <w:rFonts w:asciiTheme="minorHAnsi" w:hAnsiTheme="minorHAnsi" w:cstheme="minorBidi"/>
+        </w:rPr>
+        <w:t>pageentry</w:t>
+      </w:r>
+      <w:proofErr w:type="spellEnd"/>
+      <w:r>
+        <w:rPr>
+          <w:rFonts w:asciiTheme="minorHAnsi" w:hAnsiTheme="minorHAnsi" w:cstheme="minorBidi"/>
+        </w:rPr>
+        <w:t xml:space="preserve"> table {</w:t>
+      </w:r>
+      <w:r>
+        <w:rPr>
+          <w:rFonts w:asciiTheme="minorHAnsi" w:hAnsiTheme="minorHAnsi" w:cstheme="minorBidi"/>
+        </w:rPr>
+        <w:br/>
+      </w:r>
+      <w:r>
+        <w:rPr>
+          <w:rFonts w:asciiTheme="minorHAnsi" w:hAnsiTheme="minorHAnsi" w:cstheme="minorBidi"/>
+        </w:rPr>
+        <w:tab/>
+        <w:t>border: none;</w:t>
+      </w:r>
+      <w:r>
+        <w:rPr>
+          <w:rFonts w:asciiTheme="minorHAnsi" w:hAnsiTheme="minorHAnsi" w:cstheme="minorBidi"/>
+        </w:rPr>
+        <w:br/>
+      </w:r>
+      <w:r>
+        <w:rPr>
+          <w:rFonts w:asciiTheme="minorHAnsi" w:hAnsiTheme="minorHAnsi" w:cstheme="minorBidi"/>
+        </w:rPr>
+        <w:tab/>
+        <w:t>width: 0%;</w:t>
+      </w:r>
+      <w:r>
+        <w:rPr>
+          <w:rFonts w:asciiTheme="minorHAnsi" w:hAnsiTheme="minorHAnsi" w:cstheme="minorBidi"/>
+        </w:rPr>
+        <w:br/>
+      </w:r>
       <w:r>
         <w:rPr>
           <w:rFonts w:asciiTheme="minorHAnsi" w:hAnsiTheme="minorHAnsi" w:cstheme="minorBidi"/>
@@ -3200,18 +3335,16 @@
         <w:tab/>
         <w:t>}</w:t>
       </w:r>
-    </w:p>
-    <w:p>
-      <w:pPr>
+      <w:r>
         <w:rPr>
           <w:rFonts w:asciiTheme="minorHAnsi" w:hAnsiTheme="minorHAnsi" w:cstheme="minorBidi"/>
         </w:rPr>
-      </w:pPr>
+        <w:br/>
+      </w:r>
       <w:r>
         <w:rPr>
           <w:rFonts w:asciiTheme="minorHAnsi" w:hAnsiTheme="minorHAnsi" w:cstheme="minorBidi"/>
         </w:rPr>
-        <w:lastRenderedPageBreak/>
         <w:t>.</w:t>
       </w:r>
       <w:proofErr w:type="spellStart"/>
@@ -3226,50 +3359,67 @@
         <w:rPr>
           <w:rFonts w:asciiTheme="minorHAnsi" w:hAnsiTheme="minorHAnsi" w:cstheme="minorBidi"/>
         </w:rPr>
-        <w:t xml:space="preserve"> table {</w:t>
-      </w:r>
-    </w:p>
-    <w:p>
-      <w:pPr>
+        <w:t xml:space="preserve"> caption {</w:t>
+      </w:r>
+      <w:r>
         <w:rPr>
           <w:rFonts w:asciiTheme="minorHAnsi" w:hAnsiTheme="minorHAnsi" w:cstheme="minorBidi"/>
         </w:rPr>
-      </w:pPr>
+        <w:br/>
+      </w:r>
       <w:r>
         <w:rPr>
           <w:rFonts w:asciiTheme="minorHAnsi" w:hAnsiTheme="minorHAnsi" w:cstheme="minorBidi"/>
         </w:rPr>
         <w:tab/>
-        <w:t>border: none;</w:t>
-      </w:r>
-    </w:p>
-    <w:p>
-      <w:pPr>
-        <w:pStyle w:val="BodyText"/>
+        <w:t>font-size: 18px;</w:t>
+      </w:r>
+      <w:r>
         <w:rPr>
           <w:rFonts w:asciiTheme="minorHAnsi" w:hAnsiTheme="minorHAnsi" w:cstheme="minorBidi"/>
         </w:rPr>
-      </w:pPr>
+        <w:br/>
+      </w:r>
+      <w:r>
+        <w:rPr>
+          <w:rFonts w:asciiTheme="minorHAnsi" w:hAnsiTheme="minorHAnsi" w:cstheme="minorBidi"/>
+        </w:rPr>
+        <w:t xml:space="preserve">  </w:t>
+      </w:r>
       <w:r>
         <w:rPr>
           <w:rFonts w:asciiTheme="minorHAnsi" w:hAnsiTheme="minorHAnsi" w:cstheme="minorBidi"/>
         </w:rPr>
         <w:tab/>
+        <w:t>font-weight: bold;</w:t>
       </w:r>
       <w:r>
         <w:rPr>
           <w:rFonts w:asciiTheme="minorHAnsi" w:hAnsiTheme="minorHAnsi" w:cstheme="minorBidi"/>
         </w:rPr>
-        <w:t>}</w:t>
-      </w:r>
-    </w:p>
-    <w:p>
-      <w:pPr>
-        <w:pStyle w:val="BodyText"/>
+        <w:br/>
+      </w:r>
+      <w:r>
         <w:rPr>
           <w:rFonts w:asciiTheme="minorHAnsi" w:hAnsiTheme="minorHAnsi" w:cstheme="minorBidi"/>
         </w:rPr>
-      </w:pPr>
+        <w:tab/>
+        <w:t>}</w:t>
+      </w:r>
+    </w:p>
+    <w:p>
+      <w:pPr>
+        <w:pStyle w:val="BodyText"/>
+        <w:rPr>
+          <w:rFonts w:asciiTheme="minorHAnsi" w:hAnsiTheme="minorHAnsi" w:cstheme="minorBidi"/>
+        </w:rPr>
+      </w:pPr>
+      <w:r>
+        <w:rPr>
+          <w:rFonts w:asciiTheme="minorHAnsi" w:hAnsiTheme="minorHAnsi" w:cstheme="minorBidi"/>
+        </w:rPr>
+        <w:t xml:space="preserve">These changes get rid of the lines in the table, keeps the table small rather than extending across the entire entry, reduces the spacing between lines, adjusts title. </w:t>
+      </w:r>
       <w:r>
         <w:rPr>
           <w:rFonts w:asciiTheme="minorHAnsi" w:hAnsiTheme="minorHAnsi" w:cstheme="minorBidi"/>
@@ -3294,14 +3444,11 @@
         <w:pStyle w:val="BodyText"/>
       </w:pPr>
       <w:r>
-        <w:rPr>
-          <w:noProof/>
-        </w:rPr>
         <w:drawing>
-          <wp:inline distT="0" distB="0" distL="0" distR="0" wp14:anchorId="68342E9D" wp14:editId="34ED2D6E">
-            <wp:extent cx="2609850" cy="1181100"/>
-            <wp:effectExtent l="0" t="0" r="0" b="0"/>
-            <wp:docPr id="16" name="Picture 16"/>
+          <wp:inline distT="0" distB="0" distL="0" distR="0" wp14:anchorId="6921D878" wp14:editId="527A657C">
+            <wp:extent cx="2324424" cy="1019317"/>
+            <wp:effectExtent l="0" t="0" r="0" b="9525"/>
+            <wp:docPr id="7" name="Picture 7"/>
             <wp:cNvGraphicFramePr>
               <a:graphicFrameLocks xmlns:a="http://schemas.openxmlformats.org/drawingml/2006/main" noChangeAspect="1"/>
             </wp:cNvGraphicFramePr>
@@ -3321,7 +3468,7 @@
                   <pic:spPr>
                     <a:xfrm>
                       <a:off x="0" y="0"/>
-                      <a:ext cx="2609850" cy="1181100"/>
+                      <a:ext cx="2324424" cy="1019317"/>
                     </a:xfrm>
                     <a:prstGeom prst="rect">
                       <a:avLst/>
@@ -3357,13 +3504,7 @@
         <w:rPr>
           <w:rFonts w:asciiTheme="minorHAnsi" w:hAnsiTheme="minorHAnsi" w:cstheme="minorBidi"/>
         </w:rPr>
-        <w:t xml:space="preserve">the order various styles are applied in the website, it’s not always possible to control </w:t>
-      </w:r>
-      <w:r>
-        <w:rPr>
-          <w:rFonts w:asciiTheme="minorHAnsi" w:hAnsiTheme="minorHAnsi" w:cstheme="minorBidi"/>
-        </w:rPr>
-        <w:t xml:space="preserve">what you would </w:t>
+        <w:t xml:space="preserve">the order various styles are applied in the website, it’s not always possible to control what you would </w:t>
       </w:r>
       <w:r>
         <w:rPr>
@@ -3386,14 +3527,385 @@
     </w:p>
     <w:p>
       <w:pPr>
+        <w:pStyle w:val="Heading1"/>
+      </w:pPr>
+      <w:bookmarkStart w:id="10" w:name="_Toc193898356"/>
+      <w:r>
+        <w:t>Links to entries with tables</w:t>
+      </w:r>
+      <w:bookmarkEnd w:id="10"/>
+    </w:p>
+    <w:p>
+      <w:pPr>
+        <w:pStyle w:val="BodyText"/>
+      </w:pPr>
+      <w:r>
+        <w:t xml:space="preserve">Usually tables will be lists of similar words, such as days of the week, months, kinds of trees, etc. For some, or all of the words in the table, you may want to have a link in each </w:t>
+      </w:r>
+      <w:r>
+        <w:t>entry sense</w:t>
+      </w:r>
+      <w:r>
+        <w:t xml:space="preserve"> that points the user to the entry that contains the table. In an electronic dictionary, it’s helpful for these to be active links that can be clicked to jump to the entry with the table. One way that works nicely in FLEx is to use a custom lexical relation for this purpose. Here is a Table Reference lexical relation.</w:t>
+      </w:r>
+    </w:p>
+    <w:p>
+      <w:pPr>
+        <w:pStyle w:val="BodyText"/>
+      </w:pPr>
+      <w:r>
+        <w:drawing>
+          <wp:inline distT="0" distB="0" distL="0" distR="0" wp14:anchorId="55F511E9" wp14:editId="67A182E4">
+            <wp:extent cx="5486400" cy="1473835"/>
+            <wp:effectExtent l="0" t="0" r="0" b="0"/>
+            <wp:docPr id="9" name="Picture 9"/>
+            <wp:cNvGraphicFramePr>
+              <a:graphicFrameLocks xmlns:a="http://schemas.openxmlformats.org/drawingml/2006/main" noChangeAspect="1"/>
+            </wp:cNvGraphicFramePr>
+            <a:graphic xmlns:a="http://schemas.openxmlformats.org/drawingml/2006/main">
+              <a:graphicData uri="http://schemas.openxmlformats.org/drawingml/2006/picture">
+                <pic:pic xmlns:pic="http://schemas.openxmlformats.org/drawingml/2006/picture">
+                  <pic:nvPicPr>
+                    <pic:cNvPr id="1" name=""/>
+                    <pic:cNvPicPr/>
+                  </pic:nvPicPr>
+                  <pic:blipFill>
+                    <a:blip r:embed="rId21"/>
+                    <a:stretch>
+                      <a:fillRect/>
+                    </a:stretch>
+                  </pic:blipFill>
+                  <pic:spPr>
+                    <a:xfrm>
+                      <a:off x="0" y="0"/>
+                      <a:ext cx="5486400" cy="1473835"/>
+                    </a:xfrm>
+                    <a:prstGeom prst="rect">
+                      <a:avLst/>
+                    </a:prstGeom>
+                  </pic:spPr>
+                </pic:pic>
+              </a:graphicData>
+            </a:graphic>
+          </wp:inline>
+        </w:drawing>
+      </w:r>
+    </w:p>
+    <w:p>
+      <w:pPr>
+        <w:pStyle w:val="BodyText"/>
+      </w:pPr>
+      <w:r>
+        <w:lastRenderedPageBreak/>
+        <w:t>To demonstrate how it work</w:t>
+      </w:r>
+      <w:r>
+        <w:t>s</w:t>
+      </w:r>
+      <w:r>
+        <w:t xml:space="preserve">, we have </w:t>
+      </w:r>
+      <w:r>
+        <w:t>a sense in the</w:t>
+      </w:r>
+      <w:r>
+        <w:t xml:space="preserve"> </w:t>
+      </w:r>
+      <w:proofErr w:type="spellStart"/>
+      <w:r>
+        <w:t>Ahad</w:t>
+      </w:r>
+      <w:proofErr w:type="spellEnd"/>
+      <w:r>
+        <w:t xml:space="preserve"> entry that references the </w:t>
+      </w:r>
+      <w:proofErr w:type="spellStart"/>
+      <w:r>
+        <w:t>adlaw</w:t>
+      </w:r>
+      <w:proofErr w:type="spellEnd"/>
+      <w:r>
+        <w:t xml:space="preserve"> entry that has the table.</w:t>
+      </w:r>
+    </w:p>
+    <w:p>
+      <w:pPr>
+        <w:pStyle w:val="BodyText"/>
+      </w:pPr>
+      <w:r>
+        <w:drawing>
+          <wp:inline distT="0" distB="0" distL="0" distR="0" wp14:anchorId="419523DF" wp14:editId="118E060B">
+            <wp:extent cx="1943371" cy="323895"/>
+            <wp:effectExtent l="0" t="0" r="0" b="0"/>
+            <wp:docPr id="13" name="Picture 13"/>
+            <wp:cNvGraphicFramePr>
+              <a:graphicFrameLocks xmlns:a="http://schemas.openxmlformats.org/drawingml/2006/main" noChangeAspect="1"/>
+            </wp:cNvGraphicFramePr>
+            <a:graphic xmlns:a="http://schemas.openxmlformats.org/drawingml/2006/main">
+              <a:graphicData uri="http://schemas.openxmlformats.org/drawingml/2006/picture">
+                <pic:pic xmlns:pic="http://schemas.openxmlformats.org/drawingml/2006/picture">
+                  <pic:nvPicPr>
+                    <pic:cNvPr id="1" name=""/>
+                    <pic:cNvPicPr/>
+                  </pic:nvPicPr>
+                  <pic:blipFill>
+                    <a:blip r:embed="rId22"/>
+                    <a:stretch>
+                      <a:fillRect/>
+                    </a:stretch>
+                  </pic:blipFill>
+                  <pic:spPr>
+                    <a:xfrm>
+                      <a:off x="0" y="0"/>
+                      <a:ext cx="1943371" cy="323895"/>
+                    </a:xfrm>
+                    <a:prstGeom prst="rect">
+                      <a:avLst/>
+                    </a:prstGeom>
+                  </pic:spPr>
+                </pic:pic>
+              </a:graphicData>
+            </a:graphic>
+          </wp:inline>
+        </w:drawing>
+      </w:r>
+    </w:p>
+    <w:p>
+      <w:pPr>
+        <w:pStyle w:val="BodyText"/>
+      </w:pPr>
+      <w:r>
+        <w:t xml:space="preserve">The </w:t>
+      </w:r>
+      <w:r>
+        <w:t>display</w:t>
+      </w:r>
+      <w:r>
+        <w:t xml:space="preserve"> is set up to look like this</w:t>
+      </w:r>
+      <w:r>
+        <w:t>, where the word is an active link</w:t>
+      </w:r>
+      <w:r>
+        <w:t>:</w:t>
+      </w:r>
+    </w:p>
+    <w:p>
+      <w:pPr>
+        <w:pStyle w:val="BodyText"/>
+      </w:pPr>
+      <w:r>
+        <w:drawing>
+          <wp:inline distT="0" distB="0" distL="0" distR="0" wp14:anchorId="36E6B497" wp14:editId="4BAAE13E">
+            <wp:extent cx="2095792" cy="161948"/>
+            <wp:effectExtent l="0" t="0" r="0" b="9525"/>
+            <wp:docPr id="17" name="Picture 17"/>
+            <wp:cNvGraphicFramePr>
+              <a:graphicFrameLocks xmlns:a="http://schemas.openxmlformats.org/drawingml/2006/main" noChangeAspect="1"/>
+            </wp:cNvGraphicFramePr>
+            <a:graphic xmlns:a="http://schemas.openxmlformats.org/drawingml/2006/main">
+              <a:graphicData uri="http://schemas.openxmlformats.org/drawingml/2006/picture">
+                <pic:pic xmlns:pic="http://schemas.openxmlformats.org/drawingml/2006/picture">
+                  <pic:nvPicPr>
+                    <pic:cNvPr id="1" name=""/>
+                    <pic:cNvPicPr/>
+                  </pic:nvPicPr>
+                  <pic:blipFill>
+                    <a:blip r:embed="rId23"/>
+                    <a:stretch>
+                      <a:fillRect/>
+                    </a:stretch>
+                  </pic:blipFill>
+                  <pic:spPr>
+                    <a:xfrm>
+                      <a:off x="0" y="0"/>
+                      <a:ext cx="2095792" cy="161948"/>
+                    </a:xfrm>
+                    <a:prstGeom prst="rect">
+                      <a:avLst/>
+                    </a:prstGeom>
+                  </pic:spPr>
+                </pic:pic>
+              </a:graphicData>
+            </a:graphic>
+          </wp:inline>
+        </w:drawing>
+      </w:r>
+    </w:p>
+    <w:p>
+      <w:pPr>
+        <w:pStyle w:val="BodyText"/>
+      </w:pPr>
+      <w:r>
+        <w:t>This is the dictionary configuration to make it work.</w:t>
+      </w:r>
+    </w:p>
+    <w:p>
+      <w:pPr>
+        <w:pStyle w:val="BodyText"/>
+      </w:pPr>
+      <w:r>
+        <w:drawing>
+          <wp:inline distT="0" distB="0" distL="0" distR="0" wp14:anchorId="23AA8A8D" wp14:editId="609200F6">
+            <wp:extent cx="4839375" cy="2724530"/>
+            <wp:effectExtent l="0" t="0" r="0" b="0"/>
+            <wp:docPr id="18" name="Picture 18"/>
+            <wp:cNvGraphicFramePr>
+              <a:graphicFrameLocks xmlns:a="http://schemas.openxmlformats.org/drawingml/2006/main" noChangeAspect="1"/>
+            </wp:cNvGraphicFramePr>
+            <a:graphic xmlns:a="http://schemas.openxmlformats.org/drawingml/2006/main">
+              <a:graphicData uri="http://schemas.openxmlformats.org/drawingml/2006/picture">
+                <pic:pic xmlns:pic="http://schemas.openxmlformats.org/drawingml/2006/picture">
+                  <pic:nvPicPr>
+                    <pic:cNvPr id="1" name=""/>
+                    <pic:cNvPicPr/>
+                  </pic:nvPicPr>
+                  <pic:blipFill>
+                    <a:blip r:embed="rId24"/>
+                    <a:stretch>
+                      <a:fillRect/>
+                    </a:stretch>
+                  </pic:blipFill>
+                  <pic:spPr>
+                    <a:xfrm>
+                      <a:off x="0" y="0"/>
+                      <a:ext cx="4839375" cy="2724530"/>
+                    </a:xfrm>
+                    <a:prstGeom prst="rect">
+                      <a:avLst/>
+                    </a:prstGeom>
+                  </pic:spPr>
+                </pic:pic>
+              </a:graphicData>
+            </a:graphic>
+          </wp:inline>
+        </w:drawing>
+      </w:r>
+    </w:p>
+    <w:p>
+      <w:pPr>
+        <w:pStyle w:val="BodyText"/>
+      </w:pPr>
+      <w:r>
+        <w:t>We created a duplicate Lexical Relations node. The original node excludes the table reference type, and the duplicate node is only used for the Table Reference type as shown above. Then we can insert Before/After text that will only show up for this table reference.</w:t>
+      </w:r>
+    </w:p>
+    <w:p>
+      <w:pPr>
+        <w:pStyle w:val="BodyText"/>
+      </w:pPr>
+      <w:r>
+        <w:t>This type of relation has a back reference called “Sense Using Table” We do not want this to show anywhere in our display, so it needs to be unchecked in configuration. It also need</w:t>
+      </w:r>
+      <w:r>
+        <w:t>s</w:t>
+      </w:r>
+      <w:r>
+        <w:t xml:space="preserve"> to be unchecked in Cross References to prevent showing all of the words that are referencing the table.</w:t>
+      </w:r>
+    </w:p>
+    <w:p>
+      <w:pPr>
+        <w:pStyle w:val="BodyText"/>
+      </w:pPr>
+      <w:r>
+        <w:drawing>
+          <wp:inline distT="0" distB="0" distL="0" distR="0" wp14:anchorId="7073C449" wp14:editId="243E184E">
+            <wp:extent cx="4001058" cy="714475"/>
+            <wp:effectExtent l="0" t="0" r="0" b="9525"/>
+            <wp:docPr id="19" name="Picture 19"/>
+            <wp:cNvGraphicFramePr>
+              <a:graphicFrameLocks xmlns:a="http://schemas.openxmlformats.org/drawingml/2006/main" noChangeAspect="1"/>
+            </wp:cNvGraphicFramePr>
+            <a:graphic xmlns:a="http://schemas.openxmlformats.org/drawingml/2006/main">
+              <a:graphicData uri="http://schemas.openxmlformats.org/drawingml/2006/picture">
+                <pic:pic xmlns:pic="http://schemas.openxmlformats.org/drawingml/2006/picture">
+                  <pic:nvPicPr>
+                    <pic:cNvPr id="1" name=""/>
+                    <pic:cNvPicPr/>
+                  </pic:nvPicPr>
+                  <pic:blipFill>
+                    <a:blip r:embed="rId25"/>
+                    <a:stretch>
+                      <a:fillRect/>
+                    </a:stretch>
+                  </pic:blipFill>
+                  <pic:spPr>
+                    <a:xfrm>
+                      <a:off x="0" y="0"/>
+                      <a:ext cx="4001058" cy="714475"/>
+                    </a:xfrm>
+                    <a:prstGeom prst="rect">
+                      <a:avLst/>
+                    </a:prstGeom>
+                  </pic:spPr>
+                </pic:pic>
+              </a:graphicData>
+            </a:graphic>
+          </wp:inline>
+        </w:drawing>
+      </w:r>
+    </w:p>
+    <w:p>
+      <w:pPr>
+        <w:pStyle w:val="BodyText"/>
+      </w:pPr>
+      <w:r>
+        <w:t xml:space="preserve">An advantage of using this two-name pair reference type is that in the table entry, you can see what senses are referencing this table. </w:t>
+      </w:r>
+    </w:p>
+    <w:p>
+      <w:pPr>
+        <w:pStyle w:val="BodyText"/>
+      </w:pPr>
+      <w:r>
+        <w:drawing>
+          <wp:inline distT="0" distB="0" distL="0" distR="0" wp14:anchorId="00D6A03C" wp14:editId="44CDC8CE">
+            <wp:extent cx="2781688" cy="752580"/>
+            <wp:effectExtent l="0" t="0" r="0" b="9525"/>
+            <wp:docPr id="20" name="Picture 20"/>
+            <wp:cNvGraphicFramePr>
+              <a:graphicFrameLocks xmlns:a="http://schemas.openxmlformats.org/drawingml/2006/main" noChangeAspect="1"/>
+            </wp:cNvGraphicFramePr>
+            <a:graphic xmlns:a="http://schemas.openxmlformats.org/drawingml/2006/main">
+              <a:graphicData uri="http://schemas.openxmlformats.org/drawingml/2006/picture">
+                <pic:pic xmlns:pic="http://schemas.openxmlformats.org/drawingml/2006/picture">
+                  <pic:nvPicPr>
+                    <pic:cNvPr id="1" name=""/>
+                    <pic:cNvPicPr/>
+                  </pic:nvPicPr>
+                  <pic:blipFill>
+                    <a:blip r:embed="rId26"/>
+                    <a:stretch>
+                      <a:fillRect/>
+                    </a:stretch>
+                  </pic:blipFill>
+                  <pic:spPr>
+                    <a:xfrm>
+                      <a:off x="0" y="0"/>
+                      <a:ext cx="2781688" cy="752580"/>
+                    </a:xfrm>
+                    <a:prstGeom prst="rect">
+                      <a:avLst/>
+                    </a:prstGeom>
+                  </pic:spPr>
+                </pic:pic>
+              </a:graphicData>
+            </a:graphic>
+          </wp:inline>
+        </w:drawing>
+      </w:r>
+    </w:p>
+    <w:p>
+      <w:pPr>
         <w:pStyle w:val="BodyText"/>
       </w:pPr>
     </w:p>
     <w:sectPr>
-      <w:headerReference w:type="even" r:id="rId21"/>
-      <w:headerReference w:type="default" r:id="rId22"/>
-      <w:footerReference w:type="default" r:id="rId23"/>
-      <w:footerReference w:type="first" r:id="rId24"/>
+      <w:headerReference w:type="even" r:id="rId27"/>
+      <w:headerReference w:type="default" r:id="rId28"/>
+      <w:footerReference w:type="default" r:id="rId29"/>
+      <w:footerReference w:type="first" r:id="rId30"/>
       <w:pgSz w:w="12240" w:h="15840"/>
       <w:pgMar w:top="1440" w:right="1800" w:bottom="1440" w:left="1800" w:header="720" w:footer="720" w:gutter="0"/>
       <w:pgNumType w:start="1"/>
@@ -3443,7 +3955,7 @@
       <w:rPr>
         <w:noProof/>
       </w:rPr>
-      <w:t>9/14/2022</w:t>
+      <w:t>3/25/2025</w:t>
     </w:r>
     <w:r>
       <w:fldChar w:fldCharType="end"/>
@@ -3490,7 +4002,7 @@
         <w:rStyle w:val="PageNumber"/>
         <w:noProof/>
       </w:rPr>
-      <w:t>9/14/2022</w:t>
+      <w:t>3/25/2025</w:t>
     </w:r>
     <w:r>
       <w:rPr>
@@ -5843,6 +6355,7 @@
   <w:style w:type="character" w:default="1" w:styleId="DefaultParagraphFont">
     <w:name w:val="Default Paragraph Font"/>
     <w:uiPriority w:val="1"/>
+    <w:semiHidden/>
     <w:unhideWhenUsed/>
   </w:style>
   <w:style w:type="table" w:default="1" w:styleId="TableNormal">
@@ -6545,7 +7058,7 @@
 </file>
 
 <file path=customXml/itemProps1.xml><?xml version="1.0" encoding="utf-8"?>
-<ds:datastoreItem xmlns:ds="http://schemas.openxmlformats.org/officeDocument/2006/customXml" ds:itemID="{96C02FA2-EA18-42F4-940D-DFEC4FB89E4D}">
+<ds:datastoreItem xmlns:ds="http://schemas.openxmlformats.org/officeDocument/2006/customXml" ds:itemID="{BA99768C-12A1-4F17-8D6A-C8EBA7A053F0}">
   <ds:schemaRefs>
     <ds:schemaRef ds:uri="http://schemas.openxmlformats.org/officeDocument/2006/bibliography"/>
   </ds:schemaRefs>

</xml_diff>